<commit_message>
Update documentation, architecture diagram and README
</commit_message>
<xml_diff>
--- a/Documentation/Comment build un fichier d’installation Windows 10.11 (.NET 9 &+, WinUI 3...).docx
+++ b/Documentation/Comment build un fichier d’installation Windows 10.11 (.NET 9 &+, WinUI 3...).docx
@@ -329,13 +329,13 @@
           <w:szCs w:val="28"/>
         </w:rPr>
         <w:drawing>
-          <wp:anchor distT="0" distB="0" distL="114300" distR="114300" simplePos="0" relativeHeight="251658240" behindDoc="0" locked="0" layoutInCell="1" allowOverlap="1" wp14:anchorId="565556DA" wp14:editId="396CF489">
+          <wp:anchor distT="0" distB="0" distL="114300" distR="114300" simplePos="0" relativeHeight="251658240" behindDoc="0" locked="0" layoutInCell="1" allowOverlap="1" wp14:anchorId="565556DA" wp14:editId="639C796A">
             <wp:simplePos x="0" y="0"/>
             <wp:positionH relativeFrom="column">
-              <wp:posOffset>3550285</wp:posOffset>
+              <wp:posOffset>-26670</wp:posOffset>
             </wp:positionH>
             <wp:positionV relativeFrom="paragraph">
-              <wp:posOffset>253365</wp:posOffset>
+              <wp:posOffset>520065</wp:posOffset>
             </wp:positionV>
             <wp:extent cx="2388235" cy="694690"/>
             <wp:effectExtent l="0" t="0" r="0" b="0"/>
@@ -470,10 +470,10 @@
           <w:szCs w:val="24"/>
         </w:rPr>
         <w:drawing>
-          <wp:anchor distT="0" distB="0" distL="114300" distR="114300" simplePos="0" relativeHeight="251660288" behindDoc="0" locked="0" layoutInCell="1" allowOverlap="1" wp14:anchorId="68376441" wp14:editId="2BA0B0EB">
+          <wp:anchor distT="0" distB="0" distL="114300" distR="114300" simplePos="0" relativeHeight="251660288" behindDoc="0" locked="0" layoutInCell="1" allowOverlap="1" wp14:anchorId="68376441" wp14:editId="4BCD5278">
             <wp:simplePos x="0" y="0"/>
             <wp:positionH relativeFrom="column">
-              <wp:posOffset>-48895</wp:posOffset>
+              <wp:posOffset>2259965</wp:posOffset>
             </wp:positionH>
             <wp:positionV relativeFrom="paragraph">
               <wp:posOffset>104775</wp:posOffset>
@@ -532,15 +532,6 @@
           </wp:anchor>
         </w:drawing>
       </w:r>
-    </w:p>
-    <w:p>
-      <w:pPr>
-        <w:jc w:val="center"/>
-        <w:rPr>
-          <w:sz w:val="24"/>
-          <w:szCs w:val="24"/>
-        </w:rPr>
-      </w:pPr>
     </w:p>
     <w:p>
       <w:pPr>

</xml_diff>